<commit_message>
rerun models with new abund and zero specialists
</commit_message>
<xml_diff>
--- a/output/AbundanceModels.docx
+++ b/output/AbundanceModels.docx
@@ -10,16 +10,16 @@
         <w:tblLook w:firstRow="1" w:lastRow="0" w:firstColumn="0" w:lastColumn="0" w:noHBand="0" w:noVBand="0" w:val="0020"/>
       </w:tblPr>
       <w:tblGrid>
-        <w:gridCol w:w="1447"/>
-        <w:gridCol w:w="236"/>
-        <w:gridCol w:w="1262"/>
-        <w:gridCol w:w="605"/>
-        <w:gridCol w:w="210"/>
-        <w:gridCol w:w="1262"/>
-        <w:gridCol w:w="605"/>
-        <w:gridCol w:w="210"/>
-        <w:gridCol w:w="1262"/>
-        <w:gridCol w:w="605"/>
+        <w:gridCol w:w="1452"/>
+        <w:gridCol w:w="211"/>
+        <w:gridCol w:w="1267"/>
+        <w:gridCol w:w="607"/>
+        <w:gridCol w:w="211"/>
+        <w:gridCol w:w="1267"/>
+        <w:gridCol w:w="607"/>
+        <w:gridCol w:w="211"/>
+        <w:gridCol w:w="1267"/>
+        <w:gridCol w:w="607"/>
       </w:tblGrid>
       <w:tr>
         <w:trPr>
@@ -204,95 +204,95 @@
               <w:pStyle w:val="Compact"/>
             </w:pPr>
             <w:r>
-              <w:t xml:space="preserve">118.19</w:t>
-            </w:r>
-          </w:p>
-        </w:tc>
-        <w:tc>
-          <w:tcPr/>
-          <w:p>
-            <w:pPr>
-              <w:pStyle w:val="Compact"/>
-            </w:pPr>
-            <w:r>
-              <w:t xml:space="preserve">(59.8, 245.15)</w:t>
-            </w:r>
-          </w:p>
-        </w:tc>
-        <w:tc>
-          <w:tcPr/>
-          <w:p>
-            <w:pPr>
-              <w:pStyle w:val="Compact"/>
-            </w:pPr>
-            <w:r>
-              <w:t xml:space="preserve">1e-49</w:t>
-            </w:r>
-          </w:p>
-        </w:tc>
-        <w:tc>
-          <w:tcPr/>
-          <w:p>
-            <w:pPr>
-              <w:pStyle w:val="Compact"/>
-            </w:pPr>
-            <w:r>
-              <w:t xml:space="preserve">6.35</w:t>
-            </w:r>
-          </w:p>
-        </w:tc>
-        <w:tc>
-          <w:tcPr/>
-          <w:p>
-            <w:pPr>
-              <w:pStyle w:val="Compact"/>
-            </w:pPr>
-            <w:r>
-              <w:t xml:space="preserve">(4.53, 8.18)</w:t>
-            </w:r>
-          </w:p>
-        </w:tc>
-        <w:tc>
-          <w:tcPr/>
-          <w:p>
-            <w:pPr>
-              <w:pStyle w:val="Compact"/>
-            </w:pPr>
-            <w:r>
-              <w:t xml:space="preserve">7e-08</w:t>
-            </w:r>
-          </w:p>
-        </w:tc>
-        <w:tc>
-          <w:tcPr/>
-          <w:p>
-            <w:pPr>
-              <w:pStyle w:val="Compact"/>
-            </w:pPr>
-            <w:r>
-              <w:t xml:space="preserve">5.16</w:t>
-            </w:r>
-          </w:p>
-        </w:tc>
-        <w:tc>
-          <w:tcPr/>
-          <w:p>
-            <w:pPr>
-              <w:pStyle w:val="Compact"/>
-            </w:pPr>
-            <w:r>
-              <w:t xml:space="preserve">(3.73, 6.6)</w:t>
-            </w:r>
-          </w:p>
-        </w:tc>
-        <w:tc>
-          <w:tcPr/>
-          <w:p>
-            <w:pPr>
-              <w:pStyle w:val="Compact"/>
-            </w:pPr>
-            <w:r>
-              <w:t xml:space="preserve">3e-08</w:t>
+              <w:t xml:space="preserve">94.03</w:t>
+            </w:r>
+          </w:p>
+        </w:tc>
+        <w:tc>
+          <w:tcPr/>
+          <w:p>
+            <w:pPr>
+              <w:pStyle w:val="Compact"/>
+            </w:pPr>
+            <w:r>
+              <w:t xml:space="preserve">(25.31, 435.84)</w:t>
+            </w:r>
+          </w:p>
+        </w:tc>
+        <w:tc>
+          <w:tcPr/>
+          <w:p>
+            <w:pPr>
+              <w:pStyle w:val="Compact"/>
+            </w:pPr>
+            <w:r>
+              <w:t xml:space="preserve">3e-12</w:t>
+            </w:r>
+          </w:p>
+        </w:tc>
+        <w:tc>
+          <w:tcPr/>
+          <w:p>
+            <w:pPr>
+              <w:pStyle w:val="Compact"/>
+            </w:pPr>
+            <w:r>
+              <w:t xml:space="preserve">6.39</w:t>
+            </w:r>
+          </w:p>
+        </w:tc>
+        <w:tc>
+          <w:tcPr/>
+          <w:p>
+            <w:pPr>
+              <w:pStyle w:val="Compact"/>
+            </w:pPr>
+            <w:r>
+              <w:t xml:space="preserve">(4.7, 8.07)</w:t>
+            </w:r>
+          </w:p>
+        </w:tc>
+        <w:tc>
+          <w:tcPr/>
+          <w:p>
+            <w:pPr>
+              <w:pStyle w:val="Compact"/>
+            </w:pPr>
+            <w:r>
+              <w:t xml:space="preserve">4e-09</w:t>
+            </w:r>
+          </w:p>
+        </w:tc>
+        <w:tc>
+          <w:tcPr/>
+          <w:p>
+            <w:pPr>
+              <w:pStyle w:val="Compact"/>
+            </w:pPr>
+            <w:r>
+              <w:t xml:space="preserve">5.2</w:t>
+            </w:r>
+          </w:p>
+        </w:tc>
+        <w:tc>
+          <w:tcPr/>
+          <w:p>
+            <w:pPr>
+              <w:pStyle w:val="Compact"/>
+            </w:pPr>
+            <w:r>
+              <w:t xml:space="preserve">(3.84, 6.56)</w:t>
+            </w:r>
+          </w:p>
+        </w:tc>
+        <w:tc>
+          <w:tcPr/>
+          <w:p>
+            <w:pPr>
+              <w:pStyle w:val="Compact"/>
+            </w:pPr>
+            <w:r>
+              <w:t xml:space="preserve">3e-09</w:t>
             </w:r>
           </w:p>
         </w:tc>
@@ -316,29 +316,29 @@
               <w:pStyle w:val="Compact"/>
             </w:pPr>
             <w:r>
-              <w:t xml:space="preserve">0.63</w:t>
-            </w:r>
-          </w:p>
-        </w:tc>
-        <w:tc>
-          <w:tcPr/>
-          <w:p>
-            <w:pPr>
-              <w:pStyle w:val="Compact"/>
-            </w:pPr>
-            <w:r>
-              <w:t xml:space="preserve">(0.27, 1.42)</w:t>
-            </w:r>
-          </w:p>
-        </w:tc>
-        <w:tc>
-          <w:tcPr/>
-          <w:p>
-            <w:pPr>
-              <w:pStyle w:val="Compact"/>
-            </w:pPr>
-            <w:r>
-              <w:t xml:space="preserve">0.2</w:t>
+              <w:t xml:space="preserve">0.68</w:t>
+            </w:r>
+          </w:p>
+        </w:tc>
+        <w:tc>
+          <w:tcPr/>
+          <w:p>
+            <w:pPr>
+              <w:pStyle w:val="Compact"/>
+            </w:pPr>
+            <w:r>
+              <w:t xml:space="preserve">(0.12, 3.44)</w:t>
+            </w:r>
+          </w:p>
+        </w:tc>
+        <w:tc>
+          <w:tcPr/>
+          <w:p>
+            <w:pPr>
+              <w:pStyle w:val="Compact"/>
+            </w:pPr>
+            <w:r>
+              <w:t xml:space="preserve">0.6</w:t>
             </w:r>
           </w:p>
         </w:tc>
@@ -360,18 +360,18 @@
               <w:pStyle w:val="Compact"/>
             </w:pPr>
             <w:r>
-              <w:t xml:space="preserve">(-6.15, -1.64)</w:t>
-            </w:r>
-          </w:p>
-        </w:tc>
-        <w:tc>
-          <w:tcPr/>
-          <w:p>
-            <w:pPr>
-              <w:pStyle w:val="Compact"/>
-            </w:pPr>
-            <w:r>
-              <w:t xml:space="preserve">0.001</w:t>
+              <w:t xml:space="preserve">(-6.02, -1.76)</w:t>
+            </w:r>
+          </w:p>
+        </w:tc>
+        <w:tc>
+          <w:tcPr/>
+          <w:p>
+            <w:pPr>
+              <w:pStyle w:val="Compact"/>
+            </w:pPr>
+            <w:r>
+              <w:t xml:space="preserve">7e-04</w:t>
             </w:r>
           </w:p>
         </w:tc>
@@ -393,18 +393,18 @@
               <w:pStyle w:val="Compact"/>
             </w:pPr>
             <w:r>
-              <w:t xml:space="preserve">(-4.84, -1.3)</w:t>
-            </w:r>
-          </w:p>
-        </w:tc>
-        <w:tc>
-          <w:tcPr/>
-          <w:p>
-            <w:pPr>
-              <w:pStyle w:val="Compact"/>
-            </w:pPr>
-            <w:r>
-              <w:t xml:space="preserve">0.001</w:t>
+              <w:t xml:space="preserve">(-4.78, -1.35)</w:t>
+            </w:r>
+          </w:p>
+        </w:tc>
+        <w:tc>
+          <w:tcPr/>
+          <w:p>
+            <w:pPr>
+              <w:pStyle w:val="Compact"/>
+            </w:pPr>
+            <w:r>
+              <w:t xml:space="preserve">9e-04</w:t>
             </w:r>
           </w:p>
         </w:tc>
@@ -428,95 +428,95 @@
               <w:pStyle w:val="Compact"/>
             </w:pPr>
             <w:r>
-              <w:t xml:space="preserve">0.85</w:t>
-            </w:r>
-          </w:p>
-        </w:tc>
-        <w:tc>
-          <w:tcPr/>
-          <w:p>
-            <w:pPr>
-              <w:pStyle w:val="Compact"/>
-            </w:pPr>
-            <w:r>
-              <w:t xml:space="preserve">(0.4, 1.87)</w:t>
-            </w:r>
-          </w:p>
-        </w:tc>
-        <w:tc>
-          <w:tcPr/>
-          <w:p>
-            <w:pPr>
-              <w:pStyle w:val="Compact"/>
-            </w:pPr>
-            <w:r>
-              <w:t xml:space="preserve">0.7</w:t>
-            </w:r>
-          </w:p>
-        </w:tc>
-        <w:tc>
-          <w:tcPr/>
-          <w:p>
-            <w:pPr>
-              <w:pStyle w:val="Compact"/>
-            </w:pPr>
-            <w:r>
-              <w:t xml:space="preserve">-5.02</w:t>
-            </w:r>
-          </w:p>
-        </w:tc>
-        <w:tc>
-          <w:tcPr/>
-          <w:p>
-            <w:pPr>
-              <w:pStyle w:val="Compact"/>
-            </w:pPr>
-            <w:r>
-              <w:t xml:space="preserve">(-7.27, -2.77)</w:t>
-            </w:r>
-          </w:p>
-        </w:tc>
-        <w:tc>
-          <w:tcPr/>
-          <w:p>
-            <w:pPr>
-              <w:pStyle w:val="Compact"/>
-            </w:pPr>
-            <w:r>
-              <w:t xml:space="preserve">8e-05</w:t>
-            </w:r>
-          </w:p>
-        </w:tc>
-        <w:tc>
-          <w:tcPr/>
-          <w:p>
-            <w:pPr>
-              <w:pStyle w:val="Compact"/>
-            </w:pPr>
-            <w:r>
-              <w:t xml:space="preserve">-4.11</w:t>
-            </w:r>
-          </w:p>
-        </w:tc>
-        <w:tc>
-          <w:tcPr/>
-          <w:p>
-            <w:pPr>
-              <w:pStyle w:val="Compact"/>
-            </w:pPr>
-            <w:r>
-              <w:t xml:space="preserve">(-5.88, -2.34)</w:t>
-            </w:r>
-          </w:p>
-        </w:tc>
-        <w:tc>
-          <w:tcPr/>
-          <w:p>
-            <w:pPr>
-              <w:pStyle w:val="Compact"/>
-            </w:pPr>
-            <w:r>
-              <w:t xml:space="preserve">5e-05</w:t>
+              <w:t xml:space="preserve">0.26</w:t>
+            </w:r>
+          </w:p>
+        </w:tc>
+        <w:tc>
+          <w:tcPr/>
+          <w:p>
+            <w:pPr>
+              <w:pStyle w:val="Compact"/>
+            </w:pPr>
+            <w:r>
+              <w:t xml:space="preserve">(0.05, 1.45)</w:t>
+            </w:r>
+          </w:p>
+        </w:tc>
+        <w:tc>
+          <w:tcPr/>
+          <w:p>
+            <w:pPr>
+              <w:pStyle w:val="Compact"/>
+            </w:pPr>
+            <w:r>
+              <w:t xml:space="preserve">0.07</w:t>
+            </w:r>
+          </w:p>
+        </w:tc>
+        <w:tc>
+          <w:tcPr/>
+          <w:p>
+            <w:pPr>
+              <w:pStyle w:val="Compact"/>
+            </w:pPr>
+            <w:r>
+              <w:t xml:space="preserve">-4.99</w:t>
+            </w:r>
+          </w:p>
+        </w:tc>
+        <w:tc>
+          <w:tcPr/>
+          <w:p>
+            <w:pPr>
+              <w:pStyle w:val="Compact"/>
+            </w:pPr>
+            <w:r>
+              <w:t xml:space="preserve">(-6.91, -3.07)</w:t>
+            </w:r>
+          </w:p>
+        </w:tc>
+        <w:tc>
+          <w:tcPr/>
+          <w:p>
+            <w:pPr>
+              <w:pStyle w:val="Compact"/>
+            </w:pPr>
+            <w:r>
+              <w:t xml:space="preserve">6e-06</w:t>
+            </w:r>
+          </w:p>
+        </w:tc>
+        <w:tc>
+          <w:tcPr/>
+          <w:p>
+            <w:pPr>
+              <w:pStyle w:val="Compact"/>
+            </w:pPr>
+            <w:r>
+              <w:t xml:space="preserve">-4</w:t>
+            </w:r>
+          </w:p>
+        </w:tc>
+        <w:tc>
+          <w:tcPr/>
+          <w:p>
+            <w:pPr>
+              <w:pStyle w:val="Compact"/>
+            </w:pPr>
+            <w:r>
+              <w:t xml:space="preserve">(-5.55, -2.46)</w:t>
+            </w:r>
+          </w:p>
+        </w:tc>
+        <w:tc>
+          <w:tcPr/>
+          <w:p>
+            <w:pPr>
+              <w:pStyle w:val="Compact"/>
+            </w:pPr>
+            <w:r>
+              <w:t xml:space="preserve">7e-06</w:t>
             </w:r>
           </w:p>
         </w:tc>
@@ -562,7 +562,7 @@
               <w:pStyle w:val="Compact"/>
             </w:pPr>
             <w:r>
-              <w:t xml:space="preserve">0.02</w:t>
+              <w:t xml:space="preserve">0.3</w:t>
             </w:r>
           </w:p>
         </w:tc>
@@ -628,7 +628,7 @@
               <w:pStyle w:val="Compact"/>
             </w:pPr>
             <w:r>
-              <w:t xml:space="preserve">0.9</w:t>
+              <w:t xml:space="preserve">1</w:t>
             </w:r>
           </w:p>
         </w:tc>
@@ -652,51 +652,51 @@
               <w:pStyle w:val="Compact"/>
             </w:pPr>
             <w:r>
-              <w:t xml:space="preserve">1.94</w:t>
-            </w:r>
-          </w:p>
-        </w:tc>
-        <w:tc>
-          <w:tcPr/>
-          <w:p>
-            <w:pPr>
-              <w:pStyle w:val="Compact"/>
-            </w:pPr>
-            <w:r>
-              <w:t xml:space="preserve">(0.52, 7.14)</w:t>
-            </w:r>
-          </w:p>
-        </w:tc>
-        <w:tc>
-          <w:tcPr/>
-          <w:p>
-            <w:pPr>
-              <w:pStyle w:val="Compact"/>
-            </w:pPr>
-            <w:r>
-              <w:t xml:space="preserve">0.3</w:t>
-            </w:r>
-          </w:p>
-        </w:tc>
-        <w:tc>
-          <w:tcPr/>
-          <w:p>
-            <w:pPr>
-              <w:pStyle w:val="Compact"/>
-            </w:pPr>
-            <w:r>
-              <w:t xml:space="preserve">3.64</w:t>
-            </w:r>
-          </w:p>
-        </w:tc>
-        <w:tc>
-          <w:tcPr/>
-          <w:p>
-            <w:pPr>
-              <w:pStyle w:val="Compact"/>
-            </w:pPr>
-            <w:r>
-              <w:t xml:space="preserve">(-0.18, 7.47)</w:t>
+              <w:t xml:space="preserve">0.48</w:t>
+            </w:r>
+          </w:p>
+        </w:tc>
+        <w:tc>
+          <w:tcPr/>
+          <w:p>
+            <w:pPr>
+              <w:pStyle w:val="Compact"/>
+            </w:pPr>
+            <w:r>
+              <w:t xml:space="preserve">(0.03, 6.74)</w:t>
+            </w:r>
+          </w:p>
+        </w:tc>
+        <w:tc>
+          <w:tcPr/>
+          <w:p>
+            <w:pPr>
+              <w:pStyle w:val="Compact"/>
+            </w:pPr>
+            <w:r>
+              <w:t xml:space="preserve">0.5</w:t>
+            </w:r>
+          </w:p>
+        </w:tc>
+        <w:tc>
+          <w:tcPr/>
+          <w:p>
+            <w:pPr>
+              <w:pStyle w:val="Compact"/>
+            </w:pPr>
+            <w:r>
+              <w:t xml:space="preserve">2.89</w:t>
+            </w:r>
+          </w:p>
+        </w:tc>
+        <w:tc>
+          <w:tcPr/>
+          <w:p>
+            <w:pPr>
+              <w:pStyle w:val="Compact"/>
+            </w:pPr>
+            <w:r>
+              <w:t xml:space="preserve">(-0.12, 5.9)</w:t>
             </w:r>
           </w:p>
         </w:tc>
@@ -718,35 +718,39 @@
               <w:pStyle w:val="Compact"/>
             </w:pPr>
             <w:r>
-              <w:t xml:space="preserve">3.23</w:t>
-            </w:r>
-          </w:p>
-        </w:tc>
-        <w:tc>
-          <w:tcPr/>
-          <w:p>
-            <w:pPr>
-              <w:pStyle w:val="Compact"/>
-            </w:pPr>
-            <w:r>
-              <w:t xml:space="preserve">(0.23, 6.23)</w:t>
-            </w:r>
-          </w:p>
-        </w:tc>
-        <w:tc>
-          <w:tcPr/>
-          <w:p>
-            <w:pPr>
-              <w:pStyle w:val="Compact"/>
-            </w:pPr>
-            <w:r>
-              <w:t xml:space="preserve">0.04</w:t>
+              <w:t xml:space="preserve">2.35</w:t>
+            </w:r>
+          </w:p>
+        </w:tc>
+        <w:tc>
+          <w:tcPr/>
+          <w:p>
+            <w:pPr>
+              <w:pStyle w:val="Compact"/>
+            </w:pPr>
+            <w:r>
+              <w:t xml:space="preserve">(-0.07, 4.78)</w:t>
+            </w:r>
+          </w:p>
+        </w:tc>
+        <w:tc>
+          <w:tcPr/>
+          <w:p>
+            <w:pPr>
+              <w:pStyle w:val="Compact"/>
+            </w:pPr>
+            <w:r>
+              <w:t xml:space="preserve">0.06</w:t>
             </w:r>
           </w:p>
         </w:tc>
       </w:tr>
     </w:tbl>
-    <w:sectPr/>
+    <w:sectPr>
+      <w:footnotePr>
+        <w:numRestart w:val="eachSect"/>
+      </w:footnotePr>
+    </w:sectPr>
   </w:body>
 </w:document>
 </file>
@@ -918,8 +922,6 @@
     </w:pPr>
     <w:rPr>
       <w:rFonts w:asciiTheme="majorHAnsi" w:cstheme="majorBidi" w:eastAsiaTheme="majorEastAsia" w:hAnsiTheme="majorHAnsi"/>
-      <w:spacing w:val="-10"/>
-      <w:kern w:val="28"/>
       <w:sz w:val="56"/>
       <w:szCs w:val="56"/>
     </w:rPr>
@@ -932,8 +934,6 @@
     <w:rsid w:val="00A10FD9"/>
     <w:rPr>
       <w:rFonts w:asciiTheme="majorHAnsi" w:cstheme="majorBidi" w:eastAsiaTheme="majorEastAsia" w:hAnsiTheme="majorHAnsi"/>
-      <w:spacing w:val="-10"/>
-      <w:kern w:val="28"/>
       <w:sz w:val="56"/>
       <w:szCs w:val="56"/>
     </w:rPr>
@@ -974,23 +974,31 @@
   </w:style>
   <w:style w:customStyle="1" w:styleId="Author" w:type="paragraph">
     <w:name w:val="Author"/>
+    <w:basedOn w:val="Title"/>
     <w:next w:val="BodyText"/>
     <w:qFormat/>
     <w:pPr>
       <w:keepNext/>
       <w:keepLines/>
-      <w:jc w:val="center"/>
-    </w:pPr>
+    </w:pPr>
+    <w:rPr>
+      <w:sz w:val="24"/>
+      <w:szCs w:val="24"/>
+    </w:rPr>
   </w:style>
   <w:style w:styleId="Date" w:type="paragraph">
     <w:name w:val="Date"/>
+    <w:basedOn w:val="Title"/>
     <w:next w:val="BodyText"/>
     <w:qFormat/>
     <w:pPr>
       <w:keepNext/>
       <w:keepLines/>
-      <w:jc w:val="center"/>
-    </w:pPr>
+    </w:pPr>
+    <w:rPr>
+      <w:sz w:val="24"/>
+      <w:szCs w:val="24"/>
+    </w:rPr>
   </w:style>
   <w:style w:customStyle="1" w:styleId="AbstractTitle" w:type="paragraph">
     <w:name w:val="Abstract Title"/>

</xml_diff>